<commit_message>
docs: enlace real del repositorio en el informe y el README
El enunciado pide el enlace al repositorio como entregable. Se sustituye el
marcador por la URL definitiva y se regenera el .docx del informe.
</commit_message>
<xml_diff>
--- a/docs/Informe-Tecnico-BigData-Geoespacial.docx
+++ b/docs/Informe-Tecnico-BigData-Geoespacial.docx
@@ -125,15 +125,7 @@
           <w:sz w:val="19"/>
           <w:szCs w:val="19"/>
         </w:rPr>
-        <w:t xml:space="preserve"> </w:t>
-      </w:r>
-      <w:r>
-        <w:rPr>
-          <w:rFonts w:ascii="Consolas" w:cs="Consolas" w:eastAsia="Consolas" w:hAnsi="Consolas"/>
-          <w:sz w:val="16"/>
-          <w:szCs w:val="16"/>
-        </w:rPr>
-        <w:t xml:space="preserve">&lt;URL-DEL-REPOSITORIO&gt;</w:t>
+        <w:t xml:space="preserve"> https://github.com/Cristian-Tg/Proyecto-BigData-Datos-Geoespaciales-</w:t>
       </w:r>
     </w:p>
     <w:p>

</xml_diff>